<commit_message>
Resolve doc conflicts, add SRS decisions, redraw use case diagram
</commit_message>
<xml_diff>
--- a/Documents/SRS_Electronics_Store_Inventory_Management_System.docx
+++ b/Documents/SRS_Electronics_Store_Inventory_Management_System.docx
@@ -734,7 +734,7 @@
               <w:rPr/>
             </w:pPr>
             <w:r>
-              <w:t xml:space="preserve">Manage products, stock, suppliers, purchase orders, view reports</w:t>
+              <w:t xml:space="preserve">Manage products, stock, suppliers, purchase orders, record sales and returns, view reports</w:t>
             </w:r>
             <w:r/>
           </w:p>
@@ -3630,6 +3630,582 @@
             </w:pPr>
             <w:r>
               <w:t xml:space="preserve">The system shall retain transaction and invoice records per applicable local regulations.</w:t>
+            </w:r>
+            <w:r/>
+          </w:p>
+        </w:tc>
+      </w:tr>
+    </w:tbl>
+    <w:p>
+      <w:pPr>
+        <w:pStyle w:val="709"/>
+        <w:pBdr/>
+        <w:spacing w:after="200" w:before="400"/>
+        <w:ind/>
+        <w:rPr/>
+      </w:pPr>
+      <w:r>
+        <w:t xml:space="preserve">5. Assumptions and Design Decisions</w:t>
+      </w:r>
+      <w:r/>
+    </w:p>
+    <w:p>
+      <w:pPr>
+        <w:pBdr/>
+        <w:spacing w:after="150"/>
+        <w:ind/>
+        <w:rPr/>
+      </w:pPr>
+      <w:r>
+        <w:t xml:space="preserve">The following decisions resolve points the requirements leave open. They are the basis for the use case flows and test cases.</w:t>
+      </w:r>
+    </w:p>
+    <w:tbl>
+      <w:tblPr>
+        <w:tblW w:w="9740" w:type="dxa"/>
+        <w:tblBorders>
+          <w:top w:val="single" w:color="auto" w:sz="4" w:space="0"/>
+          <w:left w:val="single" w:color="auto" w:sz="4" w:space="0"/>
+          <w:bottom w:val="single" w:color="auto" w:sz="4" w:space="0"/>
+          <w:right w:val="single" w:color="auto" w:sz="4" w:space="0"/>
+          <w:insideH w:val="single" w:color="auto" w:sz="4" w:space="0"/>
+          <w:insideV w:val="single" w:color="auto" w:sz="4" w:space="0"/>
+        </w:tblBorders>
+        <w:tblLook w:val="04A0" w:firstRow="1" w:lastRow="0" w:firstColumn="1" w:lastColumn="0" w:noHBand="0" w:noVBand="1"/>
+      </w:tblPr>
+      <w:tblGrid>
+        <w:gridCol w:w="1200"/>
+        <w:gridCol w:w="2200"/>
+        <w:gridCol w:w="6340"/>
+      </w:tblGrid>
+      <w:tr>
+        <w:trPr>
+          <w:tblHeader/>
+        </w:trPr>
+        <w:tc>
+          <w:tcPr>
+            <w:shd w:val="clear" w:color="auto" w:fill="2e5496"/>
+            <w:tcBorders/>
+            <w:tcW w:w="1200" w:type="dxa"/>
+          </w:tcPr>
+          <w:p>
+            <w:pPr>
+              <w:pBdr/>
+              <w:spacing/>
+              <w:ind/>
+              <w:rPr/>
+            </w:pPr>
+            <w:r>
+              <w:rPr>
+                <w:b/>
+                <w:bCs/>
+                <w:color w:val="ffffff"/>
+              </w:rPr>
+              <w:t xml:space="preserve">ID</w:t>
+            </w:r>
+            <w:r/>
+          </w:p>
+        </w:tc>
+        <w:tc>
+          <w:tcPr>
+            <w:shd w:val="clear" w:color="auto" w:fill="2e5496"/>
+            <w:tcBorders/>
+            <w:tcW w:w="2200" w:type="dxa"/>
+          </w:tcPr>
+          <w:p>
+            <w:pPr>
+              <w:pBdr/>
+              <w:spacing/>
+              <w:ind/>
+              <w:rPr/>
+            </w:pPr>
+            <w:r>
+              <w:rPr>
+                <w:b/>
+                <w:bCs/>
+                <w:color w:val="ffffff"/>
+              </w:rPr>
+              <w:t xml:space="preserve">Topic</w:t>
+            </w:r>
+            <w:r/>
+          </w:p>
+        </w:tc>
+        <w:tc>
+          <w:tcPr>
+            <w:shd w:val="clear" w:color="auto" w:fill="2e5496"/>
+            <w:tcBorders/>
+            <w:tcW w:w="6340" w:type="dxa"/>
+          </w:tcPr>
+          <w:p>
+            <w:pPr>
+              <w:pBdr/>
+              <w:spacing/>
+              <w:ind/>
+              <w:rPr/>
+            </w:pPr>
+            <w:r>
+              <w:rPr>
+                <w:b/>
+                <w:bCs/>
+                <w:color w:val="ffffff"/>
+              </w:rPr>
+              <w:t xml:space="preserve">Decision</w:t>
+            </w:r>
+            <w:r/>
+          </w:p>
+        </w:tc>
+      </w:tr>
+      <w:tr>
+        <w:trPr/>
+        <w:tc>
+          <w:tcPr>
+            <w:tcBorders/>
+            <w:tcW w:w="1200" w:type="dxa"/>
+          </w:tcPr>
+          <w:p>
+            <w:pPr>
+              <w:pBdr/>
+              <w:spacing/>
+              <w:ind/>
+              <w:rPr/>
+            </w:pPr>
+            <w:r>
+              <w:t xml:space="preserve">A-1</w:t>
+            </w:r>
+            <w:r/>
+          </w:p>
+        </w:tc>
+        <w:tc>
+          <w:tcPr>
+            <w:tcBorders/>
+            <w:tcW w:w="2200" w:type="dxa"/>
+          </w:tcPr>
+          <w:p>
+            <w:pPr>
+              <w:pBdr/>
+              <w:spacing/>
+              <w:ind/>
+              <w:rPr/>
+            </w:pPr>
+            <w:r>
+              <w:t xml:space="preserve">Return window (FR-4.2)</w:t>
+            </w:r>
+            <w:r/>
+          </w:p>
+        </w:tc>
+        <w:tc>
+          <w:tcPr>
+            <w:tcBorders/>
+            <w:tcW w:w="6340" w:type="dxa"/>
+          </w:tcPr>
+          <w:p>
+            <w:pPr>
+              <w:pBdr/>
+              <w:spacing/>
+              <w:ind/>
+              <w:rPr/>
+            </w:pPr>
+            <w:r>
+              <w:t xml:space="preserve">Returns are accepted for up to 30 days after the sale date. Returns outside this window need Manager approval, which is logged. Damaged or defective returns are recorded but are not restocked as sellable stock.</w:t>
+            </w:r>
+            <w:r/>
+          </w:p>
+        </w:tc>
+      </w:tr>
+      <w:tr>
+        <w:trPr/>
+        <w:tc>
+          <w:tcPr>
+            <w:tcBorders/>
+            <w:tcW w:w="1200" w:type="dxa"/>
+          </w:tcPr>
+          <w:p>
+            <w:pPr>
+              <w:pBdr/>
+              <w:spacing/>
+              <w:ind/>
+              <w:rPr/>
+            </w:pPr>
+            <w:r>
+              <w:t xml:space="preserve">A-2</w:t>
+            </w:r>
+            <w:r/>
+          </w:p>
+        </w:tc>
+        <w:tc>
+          <w:tcPr>
+            <w:tcBorders/>
+            <w:tcW w:w="2200" w:type="dxa"/>
+          </w:tcPr>
+          <w:p>
+            <w:pPr>
+              <w:pBdr/>
+              <w:spacing/>
+              <w:ind/>
+              <w:rPr/>
+            </w:pPr>
+            <w:r>
+              <w:t xml:space="preserve">Record retention (NFR-16)</w:t>
+            </w:r>
+            <w:r/>
+          </w:p>
+        </w:tc>
+        <w:tc>
+          <w:tcPr>
+            <w:tcBorders/>
+            <w:tcW w:w="6340" w:type="dxa"/>
+          </w:tcPr>
+          <w:p>
+            <w:pPr>
+              <w:pBdr/>
+              <w:spacing/>
+              <w:ind/>
+              <w:rPr/>
+            </w:pPr>
+            <w:r>
+              <w:t xml:space="preserve">Sales, return and invoice records are retained for at least 8 years from the transaction date and cannot be deleted within that period. The period is configurable, and the jurisdiction is assumed to be India (INR/GST); confirm against local regulations at deployment.</w:t>
+            </w:r>
+            <w:r/>
+          </w:p>
+        </w:tc>
+      </w:tr>
+      <w:tr>
+        <w:trPr/>
+        <w:tc>
+          <w:tcPr>
+            <w:tcBorders/>
+            <w:tcW w:w="1200" w:type="dxa"/>
+          </w:tcPr>
+          <w:p>
+            <w:pPr>
+              <w:pBdr/>
+              <w:spacing/>
+              <w:ind/>
+              <w:rPr/>
+            </w:pPr>
+            <w:r>
+              <w:t xml:space="preserve">A-3</w:t>
+            </w:r>
+            <w:r/>
+          </w:p>
+        </w:tc>
+        <w:tc>
+          <w:tcPr>
+            <w:tcBorders/>
+            <w:tcW w:w="2200" w:type="dxa"/>
+          </w:tcPr>
+          <w:p>
+            <w:pPr>
+              <w:pBdr/>
+              <w:spacing/>
+              <w:ind/>
+              <w:rPr/>
+            </w:pPr>
+            <w:r>
+              <w:t xml:space="preserve">Unit cost for valuation (FR-6.1)</w:t>
+            </w:r>
+            <w:r/>
+          </w:p>
+        </w:tc>
+        <w:tc>
+          <w:tcPr>
+            <w:tcBorders/>
+            <w:tcW w:w="6340" w:type="dxa"/>
+          </w:tcPr>
+          <w:p>
+            <w:pPr>
+              <w:pBdr/>
+              <w:spacing/>
+              <w:ind/>
+              <w:rPr/>
+            </w:pPr>
+            <w:r>
+              <w:t xml:space="preserve">Unit cost is the weighted average cost per product/variant, recalculated on every PO receipt: new average = (existing qty x current average + received qty x receipt unit price) / total qty. Before any receipt, the supplier catalog price is used; if none exists, cost is 0 and the product is flagged "cost not set". Valuation = sum of (quantity x unit cost).</w:t>
+            </w:r>
+            <w:r/>
+          </w:p>
+        </w:tc>
+      </w:tr>
+      <w:tr>
+        <w:trPr/>
+        <w:tc>
+          <w:tcPr>
+            <w:tcBorders/>
+            <w:tcW w:w="1200" w:type="dxa"/>
+          </w:tcPr>
+          <w:p>
+            <w:pPr>
+              <w:pBdr/>
+              <w:spacing/>
+              <w:ind/>
+              <w:rPr/>
+            </w:pPr>
+            <w:r>
+              <w:t xml:space="preserve">A-4</w:t>
+            </w:r>
+            <w:r/>
+          </w:p>
+        </w:tc>
+        <w:tc>
+          <w:tcPr>
+            <w:tcBorders/>
+            <w:tcW w:w="2200" w:type="dxa"/>
+          </w:tcPr>
+          <w:p>
+            <w:pPr>
+              <w:pBdr/>
+              <w:spacing/>
+              <w:ind/>
+              <w:rPr/>
+            </w:pPr>
+            <w:r>
+              <w:t xml:space="preserve">Suggested reorder quantity (FR-6.3)</w:t>
+            </w:r>
+            <w:r/>
+          </w:p>
+        </w:tc>
+        <w:tc>
+          <w:tcPr>
+            <w:tcBorders/>
+            <w:tcW w:w="6340" w:type="dxa"/>
+          </w:tcPr>
+          <w:p>
+            <w:pPr>
+              <w:pBdr/>
+              <w:spacing/>
+              <w:ind/>
+              <w:rPr/>
+            </w:pPr>
+            <w:r>
+              <w:t xml:space="preserve">Suggested quantity = reorder-to level minus current stock at that location. The reorder-to level defaults to 2 x the reorder threshold and can be configured per product.</w:t>
+            </w:r>
+            <w:r/>
+          </w:p>
+        </w:tc>
+      </w:tr>
+      <w:tr>
+        <w:trPr/>
+        <w:tc>
+          <w:tcPr>
+            <w:tcBorders/>
+            <w:tcW w:w="1200" w:type="dxa"/>
+          </w:tcPr>
+          <w:p>
+            <w:pPr>
+              <w:pBdr/>
+              <w:spacing/>
+              <w:ind/>
+              <w:rPr/>
+            </w:pPr>
+            <w:r>
+              <w:t xml:space="preserve">A-5</w:t>
+            </w:r>
+            <w:r/>
+          </w:p>
+        </w:tc>
+        <w:tc>
+          <w:tcPr>
+            <w:tcBorders/>
+            <w:tcW w:w="2200" w:type="dxa"/>
+          </w:tcPr>
+          <w:p>
+            <w:pPr>
+              <w:pBdr/>
+              <w:spacing/>
+              <w:ind/>
+              <w:rPr/>
+            </w:pPr>
+            <w:r>
+              <w:t xml:space="preserve">Who can record sales and returns (FR-4.1, FR-4.2)</w:t>
+            </w:r>
+            <w:r/>
+          </w:p>
+        </w:tc>
+        <w:tc>
+          <w:tcPr>
+            <w:tcBorders/>
+            <w:tcW w:w="6340" w:type="dxa"/>
+          </w:tcPr>
+          <w:p>
+            <w:pPr>
+              <w:pBdr/>
+              <w:spacing/>
+              <w:ind/>
+              <w:rPr/>
+            </w:pPr>
+            <w:r>
+              <w:t xml:space="preserve">Cashier, Manager and Admin can record sales and process returns. Staff cannot.</w:t>
+            </w:r>
+            <w:r/>
+          </w:p>
+        </w:tc>
+      </w:tr>
+      <w:tr>
+        <w:trPr/>
+        <w:tc>
+          <w:tcPr>
+            <w:tcBorders/>
+            <w:tcW w:w="1200" w:type="dxa"/>
+          </w:tcPr>
+          <w:p>
+            <w:pPr>
+              <w:pBdr/>
+              <w:spacing/>
+              <w:ind/>
+              <w:rPr/>
+            </w:pPr>
+            <w:r>
+              <w:t xml:space="preserve">A-6</w:t>
+            </w:r>
+            <w:r/>
+          </w:p>
+        </w:tc>
+        <w:tc>
+          <w:tcPr>
+            <w:tcBorders/>
+            <w:tcW w:w="2200" w:type="dxa"/>
+          </w:tcPr>
+          <w:p>
+            <w:pPr>
+              <w:pBdr/>
+              <w:spacing/>
+              <w:ind/>
+              <w:rPr/>
+            </w:pPr>
+            <w:r>
+              <w:t xml:space="preserve">Notification recipients (FR-8.1, FR-8.2)</w:t>
+            </w:r>
+            <w:r/>
+          </w:p>
+        </w:tc>
+        <w:tc>
+          <w:tcPr>
+            <w:tcBorders/>
+            <w:tcW w:w="6340" w:type="dxa"/>
+          </w:tcPr>
+          <w:p>
+            <w:pPr>
+              <w:pBdr/>
+              <w:spacing/>
+              <w:ind/>
+              <w:rPr/>
+            </w:pPr>
+            <w:r>
+              <w:t xml:space="preserve">Low-stock and out-of-stock notifications go to Admin, Manager and Staff of the affected location. PO status notifications go to the Manager who created the PO and to Admin. Cashiers receive neither.</w:t>
+            </w:r>
+            <w:r/>
+          </w:p>
+        </w:tc>
+      </w:tr>
+      <w:tr>
+        <w:trPr/>
+        <w:tc>
+          <w:tcPr>
+            <w:tcBorders/>
+            <w:tcW w:w="1200" w:type="dxa"/>
+          </w:tcPr>
+          <w:p>
+            <w:pPr>
+              <w:pBdr/>
+              <w:spacing/>
+              <w:ind/>
+              <w:rPr/>
+            </w:pPr>
+            <w:r>
+              <w:t xml:space="preserve">A-7</w:t>
+            </w:r>
+            <w:r/>
+          </w:p>
+        </w:tc>
+        <w:tc>
+          <w:tcPr>
+            <w:tcBorders/>
+            <w:tcW w:w="2200" w:type="dxa"/>
+          </w:tcPr>
+          <w:p>
+            <w:pPr>
+              <w:pBdr/>
+              <w:spacing/>
+              <w:ind/>
+              <w:rPr/>
+            </w:pPr>
+            <w:r>
+              <w:t xml:space="preserve">PO status lifecycle (FR-3.2, FR-3.3)</w:t>
+            </w:r>
+            <w:r/>
+          </w:p>
+        </w:tc>
+        <w:tc>
+          <w:tcPr>
+            <w:tcBorders/>
+            <w:tcW w:w="6340" w:type="dxa"/>
+          </w:tcPr>
+          <w:p>
+            <w:pPr>
+              <w:pBdr/>
+              <w:spacing/>
+              <w:ind/>
+              <w:rPr/>
+            </w:pPr>
+            <w:r>
+              <w:t xml:space="preserve">Draft, Submitted, Partially Received, Received. A PO can be Cancelled only before any receipt. Draft POs are editable; after receipt starts, line items are locked.</w:t>
+            </w:r>
+            <w:r/>
+          </w:p>
+        </w:tc>
+      </w:tr>
+      <w:tr>
+        <w:trPr/>
+        <w:tc>
+          <w:tcPr>
+            <w:tcBorders/>
+            <w:tcW w:w="1200" w:type="dxa"/>
+          </w:tcPr>
+          <w:p>
+            <w:pPr>
+              <w:pBdr/>
+              <w:spacing/>
+              <w:ind/>
+              <w:rPr/>
+            </w:pPr>
+            <w:r>
+              <w:t xml:space="preserve">A-8</w:t>
+            </w:r>
+            <w:r/>
+          </w:p>
+        </w:tc>
+        <w:tc>
+          <w:tcPr>
+            <w:tcBorders/>
+            <w:tcW w:w="2200" w:type="dxa"/>
+          </w:tcPr>
+          <w:p>
+            <w:pPr>
+              <w:pBdr/>
+              <w:spacing/>
+              <w:ind/>
+              <w:rPr/>
+            </w:pPr>
+            <w:r>
+              <w:t xml:space="preserve">Requirement numbering</w:t>
+            </w:r>
+            <w:r/>
+          </w:p>
+        </w:tc>
+        <w:tc>
+          <w:tcPr>
+            <w:tcBorders/>
+            <w:tcW w:w="6340" w:type="dxa"/>
+          </w:tcPr>
+          <w:p>
+            <w:pPr>
+              <w:pBdr/>
+              <w:spacing/>
+              <w:ind/>
+              <w:rPr/>
+            </w:pPr>
+            <w:r>
+              <w:t xml:space="preserve">NFR-12 is intentionally unassigned. The numbering is kept so existing references remain valid.</w:t>
             </w:r>
             <w:r/>
           </w:p>

</xml_diff>